<commit_message>
Fold 'The Discovery Engine' into the core business plan
Add Section 4.5 (The Discovery Engine) framing the company as a local
discovery engine that monetizes via the unchanged reader-funded model,
with a deeper moat, lower content cost, and a self-feeding flywheel.
Add an engine-adjusted Years 2-3 outlook (illustrative upside table +
chart) alongside the unchanged conservative base case, a new membership
'Just Licensed' intel perk, and cross-references in the Executive
Summary and Financial Plan. Base-case figures and existing charts
unchanged.

https://claude.ai/code/session_01MZCcvfRxTVSc6PAak7p1Nw
</commit_message>
<xml_diff>
--- a/Brief_Scout_Media_Business_Plan.docx
+++ b/Brief_Scout_Media_Business_Plan.docx
@@ -394,7 +394,22 @@
           <w:i w:val="0"/>
           <w:sz w:val="22"/>
         </w:rPr>
-        <w:t>.</w:t>
+        <w:t xml:space="preserve">. These are deliberately conservative base-case figures; the proprietary </w:t>
+      </w:r>
+      <w:r>
+        <w:rPr>
+          <w:b/>
+          <w:i w:val="0"/>
+          <w:sz w:val="22"/>
+        </w:rPr>
+        <w:t>discovery engine</w:t>
+      </w:r>
+      <w:r>
+        <w:rPr>
+          <w:i w:val="0"/>
+          <w:sz w:val="22"/>
+        </w:rPr>
+        <w:t xml:space="preserve"> (Section 4.5) improves the Year-2/3 outlook by cutting content cost and lifting membership.</w:t>
       </w:r>
     </w:p>
     <w:p>
@@ -4492,6 +4507,996 @@
     </w:p>
     <w:p>
       <w:pPr>
+        <w:spacing w:before="200" w:after="80"/>
+      </w:pPr>
+      <w:r>
+        <w:rPr>
+          <w:b/>
+          <w:color w:val="2A9D8F"/>
+          <w:sz w:val="27"/>
+        </w:rPr>
+        <w:t>4.5 The Discovery Engine — the asset that powers it all</w:t>
+      </w:r>
+    </w:p>
+    <w:p>
+      <w:pPr>
+        <w:spacing w:after="120"/>
+        <w:jc w:val="both"/>
+      </w:pPr>
+      <w:r>
+        <w:rPr>
+          <w:i w:val="0"/>
+          <w:sz w:val="22"/>
+        </w:rPr>
+        <w:t xml:space="preserve">Brief Scout Media is not merely a newsletter that scouts; it is a </w:t>
+      </w:r>
+      <w:r>
+        <w:rPr>
+          <w:b/>
+          <w:i w:val="0"/>
+          <w:sz w:val="22"/>
+        </w:rPr>
+        <w:t>local discovery engine</w:t>
+      </w:r>
+      <w:r>
+        <w:rPr>
+          <w:i w:val="0"/>
+          <w:sz w:val="22"/>
+        </w:rPr>
+        <w:t xml:space="preserve"> that happens to publish a newsletter. The company systematically mines public signals — the county's weekly new-business licenses, a satellite-town beat from LaFayette to Cleveland to the Sequatchie Valley, the maker markets and the food incubator — and uses AI to find and pre-research candidates, with a human always verifying, visiting, building the relationship, and writing the story. The newsletter is the most visible </w:t>
+      </w:r>
+      <w:r>
+        <w:rPr>
+          <w:b/>
+          <w:i w:val="0"/>
+          <w:sz w:val="22"/>
+        </w:rPr>
+        <w:t>output</w:t>
+      </w:r>
+      <w:r>
+        <w:rPr>
+          <w:i w:val="0"/>
+          <w:sz w:val="22"/>
+        </w:rPr>
+        <w:t xml:space="preserve"> of the engine, not the whole business.</w:t>
+      </w:r>
+    </w:p>
+    <w:p>
+      <w:pPr>
+        <w:spacing w:after="120"/>
+        <w:jc w:val="left"/>
+      </w:pPr>
+      <w:r>
+        <w:rPr>
+          <w:b/>
+          <w:i w:val="0"/>
+          <w:sz w:val="22"/>
+        </w:rPr>
+        <w:t>The revenue model does not change</w:t>
+      </w:r>
+      <w:r>
+        <w:rPr>
+          <w:i w:val="0"/>
+          <w:sz w:val="22"/>
+        </w:rPr>
+        <w:t xml:space="preserve"> — Brief Scout Media stays reader-funded (membership + products + events, no advertising). But the engine upgrades three things:</w:t>
+      </w:r>
+    </w:p>
+    <w:p>
+      <w:pPr>
+        <w:pStyle w:val="ListBullet"/>
+        <w:spacing w:after="60"/>
+      </w:pPr>
+      <w:r>
+        <w:rPr>
+          <w:b/>
+          <w:sz w:val="21"/>
+        </w:rPr>
+        <w:t>A deeper moat.</w:t>
+      </w:r>
+      <w:r>
+        <w:rPr>
+          <w:sz w:val="21"/>
+        </w:rPr>
+        <w:t xml:space="preserve"> The promise becomes structural, not rhetorical: *we find the people building this city before anyone else, and we tell the truth about them.* Proprietary discovery is a fourth moat layer on top of trust, taste, and community — and the no-ads stance keeps it credible.</w:t>
+      </w:r>
+    </w:p>
+    <w:p>
+      <w:pPr>
+        <w:pStyle w:val="ListBullet"/>
+        <w:spacing w:after="60"/>
+      </w:pPr>
+      <w:r>
+        <w:rPr>
+          <w:b/>
+          <w:sz w:val="21"/>
+        </w:rPr>
+        <w:t>A lower content cost.</w:t>
+      </w:r>
+      <w:r>
+        <w:rPr>
+          <w:sz w:val="21"/>
+        </w:rPr>
+        <w:t xml:space="preserve"> The expensive part of local media — finding and vetting what's worth covering — is largely automated, so a solo founder or tiny team can sustain newsroom-depth coverage. This makes the Year-1 'default-alive' economics safer and makes new verticals and new markets far cheaper to launch: the engine is the reusable asset carried into a food edition or a second city.</w:t>
+      </w:r>
+    </w:p>
+    <w:p>
+      <w:pPr>
+        <w:pStyle w:val="ListBullet"/>
+        <w:spacing w:after="60"/>
+      </w:pPr>
+      <w:r>
+        <w:rPr>
+          <w:b/>
+          <w:sz w:val="21"/>
+        </w:rPr>
+        <w:t>A self-feeding flywheel.</w:t>
+      </w:r>
+      <w:r>
+        <w:rPr>
+          <w:sz w:val="21"/>
+        </w:rPr>
+        <w:t xml:space="preserve"> Events, products, and partner leads fall *out* of the pipeline rather than being separate lifts — Meet-the-Maker nights, a food-incubator showcase, maker guides, and a warm list of every new business the week it opens (celebrated editorially for free; the business-partner program kept walled and separate).</w:t>
+      </w:r>
+    </w:p>
+    <w:p>
+      <w:pPr>
+        <w:spacing w:after="120"/>
+        <w:jc w:val="left"/>
+      </w:pPr>
+      <w:r>
+        <w:rPr>
+          <w:b/>
+          <w:i w:val="0"/>
+          <w:sz w:val="22"/>
+        </w:rPr>
+        <w:t>A new membership perk.</w:t>
+      </w:r>
+      <w:r>
+        <w:rPr>
+          <w:i w:val="0"/>
+          <w:sz w:val="22"/>
+        </w:rPr>
+        <w:t xml:space="preserve"> The engine creates value that didn't exist before and that members will pay for: </w:t>
+      </w:r>
+      <w:r>
+        <w:rPr>
+          <w:b/>
+          <w:i w:val="0"/>
+          <w:sz w:val="22"/>
+        </w:rPr>
+        <w:t>first word on new openings</w:t>
+      </w:r>
+      <w:r>
+        <w:rPr>
+          <w:i w:val="0"/>
+          <w:sz w:val="22"/>
+        </w:rPr>
+        <w:t xml:space="preserve"> — the Scout's 'Just Licensed / Coming Soon' intel, delivered to members before the city knows. A concrete, unique reason to upgrade that lifts both conversion and retention.</w:t>
+      </w:r>
+    </w:p>
+    <w:p>
+      <w:pPr>
+        <w:spacing w:after="120"/>
+        <w:jc w:val="left"/>
+      </w:pPr>
+      <w:r>
+        <w:rPr>
+          <w:b/>
+          <w:i w:val="0"/>
+          <w:sz w:val="22"/>
+        </w:rPr>
+        <w:t>The one rule.</w:t>
+      </w:r>
+      <w:r>
+        <w:rPr>
+          <w:i w:val="0"/>
+          <w:sz w:val="22"/>
+        </w:rPr>
+        <w:t xml:space="preserve"> The engine *sources*; humans *own the trust*. AI finds and pre-vets; a real person verifies, visits, and writes in the Scout's voice. The moment it reads like an automated directory, the moat collapses — so the engine stays an internal weapon, never the product.</w:t>
+      </w:r>
+    </w:p>
+    <w:p>
+      <w:pPr>
+        <w:spacing w:after="120"/>
+        <w:jc w:val="both"/>
+      </w:pPr>
+      <w:r>
+        <w:rPr>
+          <w:b/>
+          <w:i w:val="0"/>
+          <w:sz w:val="22"/>
+        </w:rPr>
+        <w:t>Engine-adjusted outlook (Years 2–3).</w:t>
+      </w:r>
+      <w:r>
+        <w:rPr>
+          <w:i w:val="0"/>
+          <w:sz w:val="22"/>
+        </w:rPr>
+        <w:t xml:space="preserve"> Holding Year 1 as the conservative base case, the engine's two clearest effects — lower content/sourcing cost and the membership intel perk — improve the later years (with events and products also easier to source). The figures below are illustrative upside, not a replacement for the conservative base model in Section 9; notably, the engine-adjusted Year-3 total (~$310K) lands close to the focused-model estimate in Addendum 2.</w:t>
+      </w:r>
+    </w:p>
+    <w:tbl>
+      <w:tblPr>
+        <w:tblStyle w:val="TableGrid"/>
+        <w:tblW w:type="auto" w:w="0"/>
+        <w:jc w:val="center"/>
+        <w:tblLayout w:type="autofit"/>
+        <w:tblLook w:firstColumn="1" w:firstRow="1" w:lastColumn="0" w:lastRow="0" w:noHBand="0" w:noVBand="1" w:val="04A0"/>
+      </w:tblPr>
+      <w:tblGrid>
+        <w:gridCol w:w="1930"/>
+        <w:gridCol w:w="1930"/>
+        <w:gridCol w:w="1930"/>
+        <w:gridCol w:w="1930"/>
+        <w:gridCol w:w="1930"/>
+      </w:tblGrid>
+      <w:tr>
+        <w:tc>
+          <w:tcPr>
+            <w:tcW w:type="dxa" w:w="3168"/>
+            <w:shd w:val="clear" w:color="auto" w:fill="1B3A4B"/>
+          </w:tcPr>
+          <w:p>
+            <w:pPr>
+              <w:jc w:val="left"/>
+            </w:pPr>
+            <w:r/>
+            <w:r>
+              <w:rPr>
+                <w:b/>
+                <w:color w:val="FFFFFF"/>
+                <w:sz w:val="19"/>
+              </w:rPr>
+              <w:t>Line item</w:t>
+            </w:r>
+          </w:p>
+        </w:tc>
+        <w:tc>
+          <w:tcPr>
+            <w:tcW w:type="dxa" w:w="1872"/>
+            <w:shd w:val="clear" w:color="auto" w:fill="1B3A4B"/>
+          </w:tcPr>
+          <w:p>
+            <w:pPr>
+              <w:jc w:val="center"/>
+            </w:pPr>
+            <w:r/>
+            <w:r>
+              <w:rPr>
+                <w:b/>
+                <w:color w:val="FFFFFF"/>
+                <w:sz w:val="19"/>
+              </w:rPr>
+              <w:t>Year 2 — base</w:t>
+            </w:r>
+          </w:p>
+        </w:tc>
+        <w:tc>
+          <w:tcPr>
+            <w:tcW w:type="dxa" w:w="1872"/>
+            <w:shd w:val="clear" w:color="auto" w:fill="1B3A4B"/>
+          </w:tcPr>
+          <w:p>
+            <w:pPr>
+              <w:jc w:val="center"/>
+            </w:pPr>
+            <w:r/>
+            <w:r>
+              <w:rPr>
+                <w:b/>
+                <w:color w:val="FFFFFF"/>
+                <w:sz w:val="19"/>
+              </w:rPr>
+              <w:t>Year 2 — engine</w:t>
+            </w:r>
+          </w:p>
+        </w:tc>
+        <w:tc>
+          <w:tcPr>
+            <w:tcW w:type="dxa" w:w="1872"/>
+            <w:shd w:val="clear" w:color="auto" w:fill="1B3A4B"/>
+          </w:tcPr>
+          <w:p>
+            <w:pPr>
+              <w:jc w:val="center"/>
+            </w:pPr>
+            <w:r/>
+            <w:r>
+              <w:rPr>
+                <w:b/>
+                <w:color w:val="FFFFFF"/>
+                <w:sz w:val="19"/>
+              </w:rPr>
+              <w:t>Year 3 — base</w:t>
+            </w:r>
+          </w:p>
+        </w:tc>
+        <w:tc>
+          <w:tcPr>
+            <w:tcW w:type="dxa" w:w="1872"/>
+            <w:shd w:val="clear" w:color="auto" w:fill="1B3A4B"/>
+          </w:tcPr>
+          <w:p>
+            <w:pPr>
+              <w:jc w:val="center"/>
+            </w:pPr>
+            <w:r/>
+            <w:r>
+              <w:rPr>
+                <w:b/>
+                <w:color w:val="FFFFFF"/>
+                <w:sz w:val="19"/>
+              </w:rPr>
+              <w:t>Year 3 — engine</w:t>
+            </w:r>
+          </w:p>
+        </w:tc>
+      </w:tr>
+      <w:tr>
+        <w:tc>
+          <w:tcPr>
+            <w:tcW w:type="dxa" w:w="3168"/>
+            <w:shd w:val="clear" w:color="auto" w:fill="EEF3F4"/>
+          </w:tcPr>
+          <w:p>
+            <w:pPr>
+              <w:jc w:val="left"/>
+            </w:pPr>
+            <w:r/>
+            <w:r>
+              <w:rPr>
+                <w:b/>
+                <w:color w:val="1B3A4B"/>
+                <w:sz w:val="19"/>
+              </w:rPr>
+              <w:t>Membership</w:t>
+            </w:r>
+          </w:p>
+        </w:tc>
+        <w:tc>
+          <w:tcPr>
+            <w:tcW w:type="dxa" w:w="1872"/>
+            <w:shd w:val="clear" w:color="auto" w:fill="EEF3F4"/>
+          </w:tcPr>
+          <w:p>
+            <w:pPr>
+              <w:jc w:val="center"/>
+            </w:pPr>
+            <w:r/>
+            <w:r>
+              <w:rPr>
+                <w:b w:val="0"/>
+                <w:sz w:val="19"/>
+              </w:rPr>
+              <w:t>$54K</w:t>
+            </w:r>
+          </w:p>
+        </w:tc>
+        <w:tc>
+          <w:tcPr>
+            <w:tcW w:type="dxa" w:w="1872"/>
+            <w:shd w:val="clear" w:color="auto" w:fill="EEF3F4"/>
+          </w:tcPr>
+          <w:p>
+            <w:pPr>
+              <w:jc w:val="center"/>
+            </w:pPr>
+            <w:r/>
+            <w:r>
+              <w:rPr>
+                <w:b w:val="0"/>
+                <w:sz w:val="19"/>
+              </w:rPr>
+              <w:t>$60K</w:t>
+            </w:r>
+          </w:p>
+        </w:tc>
+        <w:tc>
+          <w:tcPr>
+            <w:tcW w:type="dxa" w:w="1872"/>
+            <w:shd w:val="clear" w:color="auto" w:fill="EEF3F4"/>
+          </w:tcPr>
+          <w:p>
+            <w:pPr>
+              <w:jc w:val="center"/>
+            </w:pPr>
+            <w:r/>
+            <w:r>
+              <w:rPr>
+                <w:b w:val="0"/>
+                <w:sz w:val="19"/>
+              </w:rPr>
+              <w:t>$120K</w:t>
+            </w:r>
+          </w:p>
+        </w:tc>
+        <w:tc>
+          <w:tcPr>
+            <w:tcW w:type="dxa" w:w="1872"/>
+            <w:shd w:val="clear" w:color="auto" w:fill="EEF3F4"/>
+          </w:tcPr>
+          <w:p>
+            <w:pPr>
+              <w:jc w:val="center"/>
+            </w:pPr>
+            <w:r/>
+            <w:r>
+              <w:rPr>
+                <w:b w:val="0"/>
+                <w:sz w:val="19"/>
+              </w:rPr>
+              <w:t>$135K</w:t>
+            </w:r>
+          </w:p>
+        </w:tc>
+      </w:tr>
+      <w:tr>
+        <w:tc>
+          <w:tcPr>
+            <w:tcW w:type="dxa" w:w="3168"/>
+            <w:shd w:val="clear" w:color="auto" w:fill="FFFFFF"/>
+          </w:tcPr>
+          <w:p>
+            <w:pPr>
+              <w:jc w:val="left"/>
+            </w:pPr>
+            <w:r/>
+            <w:r>
+              <w:rPr>
+                <w:b/>
+                <w:color w:val="1B3A4B"/>
+                <w:sz w:val="19"/>
+              </w:rPr>
+              <w:t>Events</w:t>
+            </w:r>
+          </w:p>
+        </w:tc>
+        <w:tc>
+          <w:tcPr>
+            <w:tcW w:type="dxa" w:w="1872"/>
+            <w:shd w:val="clear" w:color="auto" w:fill="FFFFFF"/>
+          </w:tcPr>
+          <w:p>
+            <w:pPr>
+              <w:jc w:val="center"/>
+            </w:pPr>
+            <w:r/>
+            <w:r>
+              <w:rPr>
+                <w:b w:val="0"/>
+                <w:sz w:val="19"/>
+              </w:rPr>
+              <w:t>$40K</w:t>
+            </w:r>
+          </w:p>
+        </w:tc>
+        <w:tc>
+          <w:tcPr>
+            <w:tcW w:type="dxa" w:w="1872"/>
+            <w:shd w:val="clear" w:color="auto" w:fill="FFFFFF"/>
+          </w:tcPr>
+          <w:p>
+            <w:pPr>
+              <w:jc w:val="center"/>
+            </w:pPr>
+            <w:r/>
+            <w:r>
+              <w:rPr>
+                <w:b w:val="0"/>
+                <w:sz w:val="19"/>
+              </w:rPr>
+              <w:t>$44K</w:t>
+            </w:r>
+          </w:p>
+        </w:tc>
+        <w:tc>
+          <w:tcPr>
+            <w:tcW w:type="dxa" w:w="1872"/>
+            <w:shd w:val="clear" w:color="auto" w:fill="FFFFFF"/>
+          </w:tcPr>
+          <w:p>
+            <w:pPr>
+              <w:jc w:val="center"/>
+            </w:pPr>
+            <w:r/>
+            <w:r>
+              <w:rPr>
+                <w:b w:val="0"/>
+                <w:sz w:val="19"/>
+              </w:rPr>
+              <w:t>$105K</w:t>
+            </w:r>
+          </w:p>
+        </w:tc>
+        <w:tc>
+          <w:tcPr>
+            <w:tcW w:type="dxa" w:w="1872"/>
+            <w:shd w:val="clear" w:color="auto" w:fill="FFFFFF"/>
+          </w:tcPr>
+          <w:p>
+            <w:pPr>
+              <w:jc w:val="center"/>
+            </w:pPr>
+            <w:r/>
+            <w:r>
+              <w:rPr>
+                <w:b w:val="0"/>
+                <w:sz w:val="19"/>
+              </w:rPr>
+              <w:t>$115K</w:t>
+            </w:r>
+          </w:p>
+        </w:tc>
+      </w:tr>
+      <w:tr>
+        <w:tc>
+          <w:tcPr>
+            <w:tcW w:type="dxa" w:w="3168"/>
+            <w:shd w:val="clear" w:color="auto" w:fill="EEF3F4"/>
+          </w:tcPr>
+          <w:p>
+            <w:pPr>
+              <w:jc w:val="left"/>
+            </w:pPr>
+            <w:r/>
+            <w:r>
+              <w:rPr>
+                <w:b/>
+                <w:color w:val="1B3A4B"/>
+                <w:sz w:val="19"/>
+              </w:rPr>
+              <w:t>Products &amp; commerce</w:t>
+            </w:r>
+          </w:p>
+        </w:tc>
+        <w:tc>
+          <w:tcPr>
+            <w:tcW w:type="dxa" w:w="1872"/>
+            <w:shd w:val="clear" w:color="auto" w:fill="EEF3F4"/>
+          </w:tcPr>
+          <w:p>
+            <w:pPr>
+              <w:jc w:val="center"/>
+            </w:pPr>
+            <w:r/>
+            <w:r>
+              <w:rPr>
+                <w:b w:val="0"/>
+                <w:sz w:val="19"/>
+              </w:rPr>
+              <w:t>$22K</w:t>
+            </w:r>
+          </w:p>
+        </w:tc>
+        <w:tc>
+          <w:tcPr>
+            <w:tcW w:type="dxa" w:w="1872"/>
+            <w:shd w:val="clear" w:color="auto" w:fill="EEF3F4"/>
+          </w:tcPr>
+          <w:p>
+            <w:pPr>
+              <w:jc w:val="center"/>
+            </w:pPr>
+            <w:r/>
+            <w:r>
+              <w:rPr>
+                <w:b w:val="0"/>
+                <w:sz w:val="19"/>
+              </w:rPr>
+              <w:t>$24K</w:t>
+            </w:r>
+          </w:p>
+        </w:tc>
+        <w:tc>
+          <w:tcPr>
+            <w:tcW w:type="dxa" w:w="1872"/>
+            <w:shd w:val="clear" w:color="auto" w:fill="EEF3F4"/>
+          </w:tcPr>
+          <w:p>
+            <w:pPr>
+              <w:jc w:val="center"/>
+            </w:pPr>
+            <w:r/>
+            <w:r>
+              <w:rPr>
+                <w:b w:val="0"/>
+                <w:sz w:val="19"/>
+              </w:rPr>
+              <w:t>$55K</w:t>
+            </w:r>
+          </w:p>
+        </w:tc>
+        <w:tc>
+          <w:tcPr>
+            <w:tcW w:type="dxa" w:w="1872"/>
+            <w:shd w:val="clear" w:color="auto" w:fill="EEF3F4"/>
+          </w:tcPr>
+          <w:p>
+            <w:pPr>
+              <w:jc w:val="center"/>
+            </w:pPr>
+            <w:r/>
+            <w:r>
+              <w:rPr>
+                <w:b w:val="0"/>
+                <w:sz w:val="19"/>
+              </w:rPr>
+              <w:t>$60K</w:t>
+            </w:r>
+          </w:p>
+        </w:tc>
+      </w:tr>
+      <w:tr>
+        <w:tc>
+          <w:tcPr>
+            <w:tcW w:type="dxa" w:w="3168"/>
+            <w:shd w:val="clear" w:color="auto" w:fill="FFFFFF"/>
+          </w:tcPr>
+          <w:p>
+            <w:pPr>
+              <w:jc w:val="left"/>
+            </w:pPr>
+            <w:r/>
+            <w:r>
+              <w:rPr>
+                <w:b/>
+                <w:color w:val="1B3A4B"/>
+                <w:sz w:val="19"/>
+              </w:rPr>
+              <w:t>Total revenue</w:t>
+            </w:r>
+          </w:p>
+        </w:tc>
+        <w:tc>
+          <w:tcPr>
+            <w:tcW w:type="dxa" w:w="1872"/>
+            <w:shd w:val="clear" w:color="auto" w:fill="FFFFFF"/>
+          </w:tcPr>
+          <w:p>
+            <w:pPr>
+              <w:jc w:val="center"/>
+            </w:pPr>
+            <w:r/>
+            <w:r>
+              <w:rPr>
+                <w:b w:val="0"/>
+                <w:sz w:val="19"/>
+              </w:rPr>
+              <w:t>$116K</w:t>
+            </w:r>
+          </w:p>
+        </w:tc>
+        <w:tc>
+          <w:tcPr>
+            <w:tcW w:type="dxa" w:w="1872"/>
+            <w:shd w:val="clear" w:color="auto" w:fill="FFFFFF"/>
+          </w:tcPr>
+          <w:p>
+            <w:pPr>
+              <w:jc w:val="center"/>
+            </w:pPr>
+            <w:r/>
+            <w:r>
+              <w:rPr>
+                <w:b w:val="0"/>
+                <w:sz w:val="19"/>
+              </w:rPr>
+              <w:t>$128K</w:t>
+            </w:r>
+          </w:p>
+        </w:tc>
+        <w:tc>
+          <w:tcPr>
+            <w:tcW w:type="dxa" w:w="1872"/>
+            <w:shd w:val="clear" w:color="auto" w:fill="FFFFFF"/>
+          </w:tcPr>
+          <w:p>
+            <w:pPr>
+              <w:jc w:val="center"/>
+            </w:pPr>
+            <w:r/>
+            <w:r>
+              <w:rPr>
+                <w:b w:val="0"/>
+                <w:sz w:val="19"/>
+              </w:rPr>
+              <w:t>$280K</w:t>
+            </w:r>
+          </w:p>
+        </w:tc>
+        <w:tc>
+          <w:tcPr>
+            <w:tcW w:type="dxa" w:w="1872"/>
+            <w:shd w:val="clear" w:color="auto" w:fill="FFFFFF"/>
+          </w:tcPr>
+          <w:p>
+            <w:pPr>
+              <w:jc w:val="center"/>
+            </w:pPr>
+            <w:r/>
+            <w:r>
+              <w:rPr>
+                <w:b w:val="0"/>
+                <w:sz w:val="19"/>
+              </w:rPr>
+              <w:t>$310K</w:t>
+            </w:r>
+          </w:p>
+        </w:tc>
+      </w:tr>
+      <w:tr>
+        <w:tc>
+          <w:tcPr>
+            <w:tcW w:type="dxa" w:w="3168"/>
+            <w:shd w:val="clear" w:color="auto" w:fill="EEF3F4"/>
+          </w:tcPr>
+          <w:p>
+            <w:pPr>
+              <w:jc w:val="left"/>
+            </w:pPr>
+            <w:r/>
+            <w:r>
+              <w:rPr>
+                <w:b/>
+                <w:color w:val="1B3A4B"/>
+                <w:sz w:val="19"/>
+              </w:rPr>
+              <w:t>Operating expenses</w:t>
+            </w:r>
+          </w:p>
+        </w:tc>
+        <w:tc>
+          <w:tcPr>
+            <w:tcW w:type="dxa" w:w="1872"/>
+            <w:shd w:val="clear" w:color="auto" w:fill="EEF3F4"/>
+          </w:tcPr>
+          <w:p>
+            <w:pPr>
+              <w:jc w:val="center"/>
+            </w:pPr>
+            <w:r/>
+            <w:r>
+              <w:rPr>
+                <w:b w:val="0"/>
+                <w:sz w:val="19"/>
+              </w:rPr>
+              <w:t>$34K</w:t>
+            </w:r>
+          </w:p>
+        </w:tc>
+        <w:tc>
+          <w:tcPr>
+            <w:tcW w:type="dxa" w:w="1872"/>
+            <w:shd w:val="clear" w:color="auto" w:fill="EEF3F4"/>
+          </w:tcPr>
+          <w:p>
+            <w:pPr>
+              <w:jc w:val="center"/>
+            </w:pPr>
+            <w:r/>
+            <w:r>
+              <w:rPr>
+                <w:b w:val="0"/>
+                <w:sz w:val="19"/>
+              </w:rPr>
+              <w:t>$30K</w:t>
+            </w:r>
+          </w:p>
+        </w:tc>
+        <w:tc>
+          <w:tcPr>
+            <w:tcW w:type="dxa" w:w="1872"/>
+            <w:shd w:val="clear" w:color="auto" w:fill="EEF3F4"/>
+          </w:tcPr>
+          <w:p>
+            <w:pPr>
+              <w:jc w:val="center"/>
+            </w:pPr>
+            <w:r/>
+            <w:r>
+              <w:rPr>
+                <w:b w:val="0"/>
+                <w:sz w:val="19"/>
+              </w:rPr>
+              <w:t>$84K</w:t>
+            </w:r>
+          </w:p>
+        </w:tc>
+        <w:tc>
+          <w:tcPr>
+            <w:tcW w:type="dxa" w:w="1872"/>
+            <w:shd w:val="clear" w:color="auto" w:fill="EEF3F4"/>
+          </w:tcPr>
+          <w:p>
+            <w:pPr>
+              <w:jc w:val="center"/>
+            </w:pPr>
+            <w:r/>
+            <w:r>
+              <w:rPr>
+                <w:b w:val="0"/>
+                <w:sz w:val="19"/>
+              </w:rPr>
+              <w:t>$76K</w:t>
+            </w:r>
+          </w:p>
+        </w:tc>
+      </w:tr>
+      <w:tr>
+        <w:tc>
+          <w:tcPr>
+            <w:tcW w:type="dxa" w:w="3168"/>
+            <w:shd w:val="clear" w:color="auto" w:fill="FFFFFF"/>
+          </w:tcPr>
+          <w:p>
+            <w:pPr>
+              <w:jc w:val="left"/>
+            </w:pPr>
+            <w:r/>
+            <w:r>
+              <w:rPr>
+                <w:b/>
+                <w:color w:val="1B3A4B"/>
+                <w:sz w:val="19"/>
+              </w:rPr>
+              <w:t>Owner's draw / profit</w:t>
+            </w:r>
+          </w:p>
+        </w:tc>
+        <w:tc>
+          <w:tcPr>
+            <w:tcW w:type="dxa" w:w="1872"/>
+            <w:shd w:val="clear" w:color="auto" w:fill="FFFFFF"/>
+          </w:tcPr>
+          <w:p>
+            <w:pPr>
+              <w:jc w:val="center"/>
+            </w:pPr>
+            <w:r/>
+            <w:r>
+              <w:rPr>
+                <w:b w:val="0"/>
+                <w:sz w:val="19"/>
+              </w:rPr>
+              <w:t>$82K</w:t>
+            </w:r>
+          </w:p>
+        </w:tc>
+        <w:tc>
+          <w:tcPr>
+            <w:tcW w:type="dxa" w:w="1872"/>
+            <w:shd w:val="clear" w:color="auto" w:fill="FFFFFF"/>
+          </w:tcPr>
+          <w:p>
+            <w:pPr>
+              <w:jc w:val="center"/>
+            </w:pPr>
+            <w:r/>
+            <w:r>
+              <w:rPr>
+                <w:b w:val="0"/>
+                <w:sz w:val="19"/>
+              </w:rPr>
+              <w:t>$98K</w:t>
+            </w:r>
+          </w:p>
+        </w:tc>
+        <w:tc>
+          <w:tcPr>
+            <w:tcW w:type="dxa" w:w="1872"/>
+            <w:shd w:val="clear" w:color="auto" w:fill="FFFFFF"/>
+          </w:tcPr>
+          <w:p>
+            <w:pPr>
+              <w:jc w:val="center"/>
+            </w:pPr>
+            <w:r/>
+            <w:r>
+              <w:rPr>
+                <w:b w:val="0"/>
+                <w:sz w:val="19"/>
+              </w:rPr>
+              <w:t>$196K</w:t>
+            </w:r>
+          </w:p>
+        </w:tc>
+        <w:tc>
+          <w:tcPr>
+            <w:tcW w:type="dxa" w:w="1872"/>
+            <w:shd w:val="clear" w:color="auto" w:fill="FFFFFF"/>
+          </w:tcPr>
+          <w:p>
+            <w:pPr>
+              <w:jc w:val="center"/>
+            </w:pPr>
+            <w:r/>
+            <w:r>
+              <w:rPr>
+                <w:b w:val="0"/>
+                <w:sz w:val="19"/>
+              </w:rPr>
+              <w:t>$234K</w:t>
+            </w:r>
+          </w:p>
+        </w:tc>
+      </w:tr>
+    </w:tbl>
+    <w:p>
+      <w:pPr>
+        <w:spacing w:after="40"/>
+      </w:pPr>
+    </w:p>
+    <w:p>
+      <w:pPr>
+        <w:spacing w:after="200"/>
+        <w:jc w:val="left"/>
+      </w:pPr>
+      <w:r>
+        <w:rPr>
+          <w:i/>
+          <w:color w:val="6B7B85"/>
+          <w:sz w:val="17"/>
+        </w:rPr>
+        <w:t>Table 4b. Discovery-engine-adjusted outlook (illustrative). Year 1 unchanged; Section 9 remains the conservative base case.</w:t>
+      </w:r>
+    </w:p>
+    <w:p>
+      <w:pPr>
+        <w:jc w:val="center"/>
+      </w:pPr>
+      <w:r>
+        <w:drawing>
+          <wp:inline xmlns:a="http://schemas.openxmlformats.org/drawingml/2006/main" xmlns:pic="http://schemas.openxmlformats.org/drawingml/2006/picture">
+            <wp:extent cx="5760720" cy="3397348"/>
+            <wp:docPr id="6" name="Picture 6"/>
+            <wp:cNvGraphicFramePr>
+              <a:graphicFrameLocks noChangeAspect="1"/>
+            </wp:cNvGraphicFramePr>
+            <a:graphic>
+              <a:graphicData uri="http://schemas.openxmlformats.org/drawingml/2006/picture">
+                <pic:pic>
+                  <pic:nvPicPr>
+                    <pic:cNvPr id="0" name="fig_engine.png"/>
+                    <pic:cNvPicPr/>
+                  </pic:nvPicPr>
+                  <pic:blipFill>
+                    <a:blip r:embed="rId14"/>
+                    <a:stretch>
+                      <a:fillRect/>
+                    </a:stretch>
+                  </pic:blipFill>
+                  <pic:spPr>
+                    <a:xfrm>
+                      <a:off x="0" y="0"/>
+                      <a:ext cx="5760720" cy="3397348"/>
+                    </a:xfrm>
+                    <a:prstGeom prst="rect"/>
+                  </pic:spPr>
+                </pic:pic>
+              </a:graphicData>
+            </a:graphic>
+          </wp:inline>
+        </w:drawing>
+      </w:r>
+    </w:p>
+    <w:p>
+      <w:pPr>
+        <w:spacing w:after="240"/>
+        <w:jc w:val="center"/>
+      </w:pPr>
+      <w:r>
+        <w:rPr>
+          <w:i/>
+          <w:color w:val="6B7B85"/>
+          <w:sz w:val="17"/>
+        </w:rPr>
+        <w:t>Figure 5b. The engine's two clearest effects — lower content cost and a stronger membership intel perk — lift owner's draw in Years 2–3.</w:t>
+      </w:r>
+    </w:p>
+    <w:p>
+      <w:pPr>
         <w:spacing w:before="280" w:after="80"/>
         <w:pBdr>
           <w:bottom w:val="single" w:sz="6" w:space="2" w:color="2A9D8F"/>
@@ -4790,7 +5795,7 @@
                 <w:b w:val="0"/>
                 <w:sz w:val="18"/>
               </w:rPr>
-              <w:t>Members-only deep dives &amp; archives; member event pricing; Scout Card discounts; community access</w:t>
+              <w:t>Members-only deep dives &amp; archives; first word on new openings (the Scout's 'Just Licensed' intel); member event pricing; Scout Card discounts; community access</w:t>
             </w:r>
           </w:p>
         </w:tc>
@@ -6223,7 +7228,7 @@
         <w:drawing>
           <wp:inline xmlns:a="http://schemas.openxmlformats.org/drawingml/2006/main" xmlns:pic="http://schemas.openxmlformats.org/drawingml/2006/picture">
             <wp:extent cx="5760720" cy="3397348"/>
-            <wp:docPr id="6" name="Picture 6"/>
+            <wp:docPr id="7" name="Picture 7"/>
             <wp:cNvGraphicFramePr>
               <a:graphicFrameLocks noChangeAspect="1"/>
             </wp:cNvGraphicFramePr>
@@ -6235,7 +7240,7 @@
                     <pic:cNvPicPr/>
                   </pic:nvPicPr>
                   <pic:blipFill>
-                    <a:blip r:embed="rId14"/>
+                    <a:blip r:embed="rId15"/>
                     <a:stretch>
                       <a:fillRect/>
                     </a:stretch>
@@ -7841,7 +8846,7 @@
         <w:drawing>
           <wp:inline xmlns:a="http://schemas.openxmlformats.org/drawingml/2006/main" xmlns:pic="http://schemas.openxmlformats.org/drawingml/2006/picture">
             <wp:extent cx="5760720" cy="7217204"/>
-            <wp:docPr id="7" name="Picture 7"/>
+            <wp:docPr id="8" name="Picture 8"/>
             <wp:cNvGraphicFramePr>
               <a:graphicFrameLocks noChangeAspect="1"/>
             </wp:cNvGraphicFramePr>
@@ -7853,7 +8858,7 @@
                     <pic:cNvPicPr/>
                   </pic:nvPicPr>
                   <pic:blipFill>
-                    <a:blip r:embed="rId15"/>
+                    <a:blip r:embed="rId16"/>
                     <a:stretch>
                       <a:fillRect/>
                     </a:stretch>
@@ -8665,7 +9670,22 @@
           <w:i w:val="0"/>
           <w:sz w:val="22"/>
         </w:rPr>
-        <w:t xml:space="preserve"> Year 1 is validation: a ~$20K owner's draw alongside a likely day job. Year 2 approaches a full-time income (~$82K) as membership compounds and events scale. Year 3 supports a full founder salary plus a part-time contractor team (already inside operating expenses) with profit to reinvest — roughly the ~18-month-to-profit arc 6AM City reports for new markets, achieved here without advertising.</w:t>
+        <w:t xml:space="preserve"> Year 1 is validation: a ~$20K owner's draw alongside a likely day job. Year 2 approaches a full-time income (~$82K) as membership compounds and events scale. Year 3 supports a full founder salary plus a part-time contractor team (already inside operating expenses) with profit to reinvest — roughly the ~18-month-to-profit arc 6AM City reports for new markets, achieved here without advertising. An </w:t>
+      </w:r>
+      <w:r>
+        <w:rPr>
+          <w:b/>
+          <w:i w:val="0"/>
+          <w:sz w:val="22"/>
+        </w:rPr>
+        <w:t>engine-adjusted view</w:t>
+      </w:r>
+      <w:r>
+        <w:rPr>
+          <w:i w:val="0"/>
+          <w:sz w:val="22"/>
+        </w:rPr>
+        <w:t xml:space="preserve"> (Section 4.5) raises Year-2 owner's draw toward ~$98K and Year-3 toward ~$234K as content costs fall and the membership intel perk lifts conversion.</w:t>
       </w:r>
     </w:p>
     <w:p>
@@ -8676,7 +9696,7 @@
         <w:drawing>
           <wp:inline xmlns:a="http://schemas.openxmlformats.org/drawingml/2006/main" xmlns:pic="http://schemas.openxmlformats.org/drawingml/2006/picture">
             <wp:extent cx="5760720" cy="3397348"/>
-            <wp:docPr id="8" name="Picture 8"/>
+            <wp:docPr id="9" name="Picture 9"/>
             <wp:cNvGraphicFramePr>
               <a:graphicFrameLocks noChangeAspect="1"/>
             </wp:cNvGraphicFramePr>
@@ -8688,7 +9708,7 @@
                     <pic:cNvPicPr/>
                   </pic:nvPicPr>
                   <pic:blipFill>
-                    <a:blip r:embed="rId16"/>
+                    <a:blip r:embed="rId17"/>
                     <a:stretch>
                       <a:fillRect/>
                     </a:stretch>

</xml_diff>

<commit_message>
Fold Scout Insights into core plan (4.6) + add beehiiv onboarding build sheet
Plan: add Section 4.6 'Scout Insights — a fourth, walled revenue line'
(no-PII, opt-in, aggregate, apolitical; depth-before-monetize; light
back-loaded contribution additive to 4.5/9). Onboarding: paste-ready
beehiiv build sheet — the 5 contest-based onboarding questions, consent
microcopy, prize/referral mechanic, welcome-email automation, and
privacy/build notes. HTML + PDF.

https://claude.ai/code/session_01MZCcvfRxTVSc6PAak7p1Nw
</commit_message>
<xml_diff>
--- a/Brief_Scout_Media_Business_Plan.docx
+++ b/Brief_Scout_Media_Business_Plan.docx
@@ -5493,6 +5493,149 @@
           <w:sz w:val="17"/>
         </w:rPr>
         <w:t>Figure 5b. The engine's two clearest effects — lower content cost and a stronger membership intel perk — lift owner's draw in Years 2–3.</w:t>
+      </w:r>
+    </w:p>
+    <w:p>
+      <w:pPr>
+        <w:spacing w:before="200" w:after="80"/>
+      </w:pPr>
+      <w:r>
+        <w:rPr>
+          <w:b/>
+          <w:color w:val="2A9D8F"/>
+          <w:sz w:val="27"/>
+        </w:rPr>
+        <w:t>4.6 Scout Insights — a fourth, walled revenue line (at scale)</w:t>
+      </w:r>
+    </w:p>
+    <w:p>
+      <w:pPr>
+        <w:spacing w:after="120"/>
+        <w:jc w:val="both"/>
+      </w:pPr>
+      <w:r>
+        <w:rPr>
+          <w:i w:val="0"/>
+          <w:sz w:val="22"/>
+        </w:rPr>
+        <w:t xml:space="preserve">Beyond the three reader-funded pillars, a fourth line emerges once the audience is large and well-profiled: </w:t>
+      </w:r>
+      <w:r>
+        <w:rPr>
+          <w:b/>
+          <w:i w:val="0"/>
+          <w:sz w:val="22"/>
+        </w:rPr>
+        <w:t>Scout Insights</w:t>
+      </w:r>
+      <w:r>
+        <w:rPr>
+          <w:i w:val="0"/>
+          <w:sz w:val="22"/>
+        </w:rPr>
+        <w:t xml:space="preserve">, a permission-based local research practice. It monetizes the brand's scarcest asset — a trusted, engaged, demographically-profiled local audience — by selling </w:t>
+      </w:r>
+      <w:r>
+        <w:rPr>
+          <w:b/>
+          <w:i w:val="0"/>
+          <w:sz w:val="22"/>
+        </w:rPr>
+        <w:t>aggregate insight, never identities</w:t>
+      </w:r>
+      <w:r>
+        <w:rPr>
+          <w:i w:val="0"/>
+          <w:sz w:val="22"/>
+        </w:rPr>
+        <w:t xml:space="preserve"> (no PII; opt-in; aggregate-only; walled from editorial; strictly apolitical). It is fully consistent with the no-advertising promise: companies buy research, not the reader's attention.</w:t>
+      </w:r>
+    </w:p>
+    <w:p>
+      <w:pPr>
+        <w:spacing w:after="120"/>
+        <w:jc w:val="left"/>
+      </w:pPr>
+      <w:r>
+        <w:rPr>
+          <w:b/>
+          <w:i w:val="0"/>
+          <w:sz w:val="22"/>
+        </w:rPr>
+        <w:t>Depth before monetization.</w:t>
+      </w:r>
+      <w:r>
+        <w:rPr>
+          <w:i w:val="0"/>
+          <w:sz w:val="22"/>
+        </w:rPr>
+        <w:t xml:space="preserve"> It begins as contest-based onboarding micro-surveys that collect consented, first-party profile data (age, neighborhood, life stage, interests) — which sharpen content, products, and events *immediately*, before a dollar of external revenue. The dataset deepens into an opt-in 'Scout Insiders' panel; house research ('The Scenic City Index') then establishes authority and B2B thought leadership; and only afterward do custom and sponsored panels open. (Full detail in the Scout Insights spec.)</w:t>
+      </w:r>
+    </w:p>
+    <w:p>
+      <w:pPr>
+        <w:spacing w:after="120"/>
+        <w:jc w:val="left"/>
+      </w:pPr>
+      <w:r>
+        <w:rPr>
+          <w:b/>
+          <w:i w:val="0"/>
+          <w:sz w:val="22"/>
+        </w:rPr>
+        <w:t>Contribution (illustrative, deliberately back-loaded):</w:t>
+      </w:r>
+      <w:r>
+        <w:rPr>
+          <w:i w:val="0"/>
+          <w:sz w:val="22"/>
+        </w:rPr>
+        <w:t xml:space="preserve"> roughly </w:t>
+      </w:r>
+      <w:r>
+        <w:rPr>
+          <w:b/>
+          <w:i w:val="0"/>
+          <w:sz w:val="22"/>
+        </w:rPr>
+        <w:t>$0 external in Year 1</w:t>
+      </w:r>
+      <w:r>
+        <w:rPr>
+          <w:i w:val="0"/>
+          <w:sz w:val="22"/>
+        </w:rPr>
+        <w:t xml:space="preserve"> — the early payoff is internal, in better-targeted content, products, and events that lift conversion and retention — then on the order of </w:t>
+      </w:r>
+      <w:r>
+        <w:rPr>
+          <w:b/>
+          <w:i w:val="0"/>
+          <w:sz w:val="22"/>
+        </w:rPr>
+        <w:t>$5–20K in Year 2</w:t>
+      </w:r>
+      <w:r>
+        <w:rPr>
+          <w:i w:val="0"/>
+          <w:sz w:val="22"/>
+        </w:rPr>
+        <w:t xml:space="preserve"> and </w:t>
+      </w:r>
+      <w:r>
+        <w:rPr>
+          <w:b/>
+          <w:i w:val="0"/>
+          <w:sz w:val="22"/>
+        </w:rPr>
+        <w:t>$25–60K in Year 3</w:t>
+      </w:r>
+      <w:r>
+        <w:rPr>
+          <w:i w:val="0"/>
+          <w:sz w:val="22"/>
+        </w:rPr>
+        <w:t xml:space="preserve"> as the Index and custom studies mature. This is additive to the figures in Sections 4.5 and 9, and comes alongside the larger, unbookable payoff of local authority and brand.</w:t>
       </w:r>
     </w:p>
     <w:p>

</xml_diff>